<commit_message>
Team 6 Student Dashboard completed and ready for review
</commit_message>
<xml_diff>
--- a/04_QA_Review/Pending_Review/ST_M2_Team6_StudentDashboardView_v01.docx
+++ b/04_QA_Review/Pending_Review/ST_M2_Team6_StudentDashboardView_v01.docx
@@ -1,6 +1,6 @@
 
 <file path=word/document.xml><?xml version="1.0" encoding="utf-8"?>
-<w:document xmlns:wpc="http://schemas.microsoft.com/office/word/2010/wordprocessingCanvas" xmlns:cx="http://schemas.microsoft.com/office/drawing/2014/chartex" xmlns:cx1="http://schemas.microsoft.com/office/drawing/2015/9/8/chartex" xmlns:cx2="http://schemas.microsoft.com/office/drawing/2015/10/21/chartex" xmlns:cx3="http://schemas.microsoft.com/office/drawing/2016/5/9/chartex" xmlns:cx4="http://schemas.microsoft.com/office/drawing/2016/5/10/chartex" xmlns:cx5="http://schemas.microsoft.com/office/drawing/2016/5/11/chartex" xmlns:cx6="http://schemas.microsoft.com/office/drawing/2016/5/12/chartex" xmlns:cx7="http://schemas.microsoft.com/office/drawing/2016/5/13/chartex" xmlns:cx8="http://schemas.microsoft.com/office/drawing/2016/5/14/chartex" xmlns:mc="http://schemas.openxmlformats.org/markup-compatibility/2006" xmlns:aink="http://schemas.microsoft.com/office/drawing/2016/ink" xmlns:am3d="http://schemas.microsoft.com/office/drawing/2017/model3d" xmlns:o="urn:schemas-microsoft-com:office:office" xmlns:oel="http://schemas.microsoft.com/office/2019/extlst" xmlns:r="http://schemas.openxmlformats.org/officeDocument/2006/relationships" xmlns:m="http://schemas.openxmlformats.org/officeDocument/2006/math" xmlns:v="urn:schemas-microsoft-com:vml" xmlns:wp14="http://schemas.microsoft.com/office/word/2010/wordprocessingDrawing" xmlns:wp="http://schemas.openxmlformats.org/drawingml/2006/wordprocessingDrawing" xmlns:w10="urn:schemas-microsoft-com:office:word" xmlns:w="http://schemas.openxmlformats.org/wordprocessingml/2006/main" xmlns:w14="http://schemas.microsoft.com/office/word/2010/wordml" xmlns:w15="http://schemas.microsoft.com/office/word/2012/wordml" xmlns:w16cex="http://schemas.microsoft.com/office/word/2018/wordml/cex" xmlns:w16cid="http://schemas.microsoft.com/office/word/2016/wordml/cid" xmlns:w16="http://schemas.microsoft.com/office/word/2018/wordml" xmlns:w16du="http://schemas.microsoft.com/office/word/2023/wordml/word16du" xmlns:w16sdtdh="http://schemas.microsoft.com/office/word/2020/wordml/sdtdatahash" xmlns:w16sdtfl="http://schemas.microsoft.com/office/word/2024/wordml/sdtformatlock" xmlns:w16se="http://schemas.microsoft.com/office/word/2015/wordml/symex" xmlns:wpg="http://schemas.microsoft.com/office/word/2010/wordprocessingGroup" xmlns:wpi="http://schemas.microsoft.com/office/word/2010/wordprocessingInk" xmlns:wne="http://schemas.microsoft.com/office/word/2006/wordml" xmlns:wps="http://schemas.microsoft.com/office/word/2010/wordprocessingShape" mc:Ignorable="w14 w15 w16se w16cid w16 w16cex w16sdtdh w16sdtfl w16du wp14">
+<w:document xmlns:wpc="http://schemas.microsoft.com/office/word/2010/wordprocessingCanvas" xmlns:cx="http://schemas.microsoft.com/office/drawing/2014/chartex" xmlns:cx1="http://schemas.microsoft.com/office/drawing/2015/9/8/chartex" xmlns:cx2="http://schemas.microsoft.com/office/drawing/2015/10/21/chartex" xmlns:cx3="http://schemas.microsoft.com/office/drawing/2016/5/9/chartex" xmlns:cx4="http://schemas.microsoft.com/office/drawing/2016/5/10/chartex" xmlns:cx5="http://schemas.microsoft.com/office/drawing/2016/5/11/chartex" xmlns:cx6="http://schemas.microsoft.com/office/drawing/2016/5/12/chartex" xmlns:cx7="http://schemas.microsoft.com/office/drawing/2016/5/13/chartex" xmlns:cx8="http://schemas.microsoft.com/office/drawing/2016/5/14/chartex" xmlns:mc="http://schemas.openxmlformats.org/markup-compatibility/2006" xmlns:aink="http://schemas.microsoft.com/office/drawing/2016/ink" xmlns:am3d="http://schemas.microsoft.com/office/drawing/2017/model3d" xmlns:o="urn:schemas-microsoft-com:office:office" xmlns:oel="http://schemas.microsoft.com/office/2019/extlst" xmlns:r="http://schemas.openxmlformats.org/officeDocument/2006/relationships" xmlns:m="http://schemas.openxmlformats.org/officeDocument/2006/math" xmlns:v="urn:schemas-microsoft-com:vml" xmlns:wp14="http://schemas.microsoft.com/office/word/2010/wordprocessingDrawing" xmlns:wp="http://schemas.openxmlformats.org/drawingml/2006/wordprocessingDrawing" xmlns:w10="urn:schemas-microsoft-com:office:word" xmlns:w="http://schemas.openxmlformats.org/wordprocessingml/2006/main" xmlns:w14="http://schemas.microsoft.com/office/word/2010/wordml" xmlns:w15="http://schemas.microsoft.com/office/word/2012/wordml" xmlns:w16cex="http://schemas.microsoft.com/office/word/2018/wordml/cex" xmlns:w16cid="http://schemas.microsoft.com/office/word/2016/wordml/cid" xmlns:w16="http://schemas.microsoft.com/office/word/2018/wordml" xmlns:w16sdtdh="http://schemas.microsoft.com/office/word/2020/wordml/sdtdatahash" xmlns:w16se="http://schemas.microsoft.com/office/word/2015/wordml/symex" xmlns:wpg="http://schemas.microsoft.com/office/word/2010/wordprocessingGroup" xmlns:wpi="http://schemas.microsoft.com/office/word/2010/wordprocessingInk" xmlns:wne="http://schemas.microsoft.com/office/word/2006/wordml" xmlns:wps="http://schemas.microsoft.com/office/word/2010/wordprocessingShape" mc:Ignorable="w14 w15 w16se w16cid w16 w16cex w16sdtdh wp14">
   <w:body>
     <w:p>
       <w:pPr>
@@ -55,18 +55,18 @@
       </w:pPr>
       <w:r>
         <w:rPr>
-          <w:rFonts w:ascii="Arial" w:hAnsi="Arial" w:cs="Arial"/>
+          <w:rFonts w:ascii="Arial" w:eastAsia="Times New Roman" w:hAnsi="Arial" w:cs="Arial"/>
+          <w:b/>
+          <w:bCs/>
           <w:noProof/>
-          <w:color w:val="000000"/>
-          <w:sz w:val="22"/>
-          <w:szCs w:val="22"/>
-          <w:bdr w:val="none" w:sz="0" w:space="0" w:color="auto" w:frame="1"/>
+          <w:lang w:eastAsia="en-US"/>
+          <w14:ligatures w14:val="standardContextual"/>
         </w:rPr>
         <w:drawing>
-          <wp:inline distT="0" distB="0" distL="0" distR="0" wp14:anchorId="4EEB624D" wp14:editId="2328963D">
-            <wp:extent cx="5943600" cy="7688580"/>
-            <wp:effectExtent l="0" t="0" r="0" b="7620"/>
-            <wp:docPr id="1423176273" name="Picture 1"/>
+          <wp:inline distT="0" distB="0" distL="0" distR="0" wp14:anchorId="2E0D5A24" wp14:editId="13018689">
+            <wp:extent cx="5943600" cy="7689850"/>
+            <wp:effectExtent l="0" t="0" r="0" b="6350"/>
+            <wp:docPr id="1" name="Picture 1"/>
             <wp:cNvGraphicFramePr>
               <a:graphicFrameLocks xmlns:a="http://schemas.openxmlformats.org/drawingml/2006/main" noChangeAspect="1"/>
             </wp:cNvGraphicFramePr>
@@ -74,10 +74,8 @@
               <a:graphicData uri="http://schemas.openxmlformats.org/drawingml/2006/picture">
                 <pic:pic xmlns:pic="http://schemas.openxmlformats.org/drawingml/2006/picture">
                   <pic:nvPicPr>
-                    <pic:cNvPr id="0" name="Picture 1"/>
-                    <pic:cNvPicPr>
-                      <a:picLocks noChangeAspect="1" noChangeArrowheads="1"/>
-                    </pic:cNvPicPr>
+                    <pic:cNvPr id="1" name="Picture 1"/>
+                    <pic:cNvPicPr/>
                   </pic:nvPicPr>
                   <pic:blipFill>
                     <a:blip r:embed="rId6">
@@ -87,23 +85,18 @@
                         </a:ext>
                       </a:extLst>
                     </a:blip>
-                    <a:srcRect/>
                     <a:stretch>
                       <a:fillRect/>
                     </a:stretch>
                   </pic:blipFill>
-                  <pic:spPr bwMode="auto">
+                  <pic:spPr>
                     <a:xfrm>
                       <a:off x="0" y="0"/>
-                      <a:ext cx="5943600" cy="7688580"/>
+                      <a:ext cx="5943600" cy="7689850"/>
                     </a:xfrm>
                     <a:prstGeom prst="rect">
                       <a:avLst/>
                     </a:prstGeom>
-                    <a:noFill/>
-                    <a:ln>
-                      <a:noFill/>
-                    </a:ln>
                   </pic:spPr>
                 </pic:pic>
               </a:graphicData>
@@ -369,25 +362,7 @@
                 <w:sz w:val="22"/>
                 <w:lang w:eastAsia="en-US"/>
               </w:rPr>
-              <w:t xml:space="preserve">Provides students with a centralized dashboard for managing career development activities, tracking applications, accessing important tools, and viewing personalized updates within the </w:t>
-            </w:r>
-            <w:proofErr w:type="spellStart"/>
-            <w:r>
-              <w:rPr>
-                <w:rFonts w:ascii="Arial" w:eastAsia="Times New Roman" w:hAnsi="Arial" w:cs="Arial"/>
-                <w:sz w:val="22"/>
-                <w:lang w:eastAsia="en-US"/>
-              </w:rPr>
-              <w:t>CareerBound</w:t>
-            </w:r>
-            <w:proofErr w:type="spellEnd"/>
-            <w:r>
-              <w:rPr>
-                <w:rFonts w:ascii="Arial" w:eastAsia="Times New Roman" w:hAnsi="Arial" w:cs="Arial"/>
-                <w:sz w:val="22"/>
-                <w:lang w:eastAsia="en-US"/>
-              </w:rPr>
-              <w:t xml:space="preserve"> system.</w:t>
+              <w:t>Provides students with a centralized dashboard for managing career development activities, tracking applications, accessing important tools, and viewing personalized updates within the CareerBound system.</w:t>
             </w:r>
           </w:p>
         </w:tc>
@@ -1776,7 +1751,7 @@
 </file>
 
 <file path=word/endnotes.xml><?xml version="1.0" encoding="utf-8"?>
-<w:endnotes xmlns:wpc="http://schemas.microsoft.com/office/word/2010/wordprocessingCanvas" xmlns:cx="http://schemas.microsoft.com/office/drawing/2014/chartex" xmlns:cx1="http://schemas.microsoft.com/office/drawing/2015/9/8/chartex" xmlns:cx2="http://schemas.microsoft.com/office/drawing/2015/10/21/chartex" xmlns:cx3="http://schemas.microsoft.com/office/drawing/2016/5/9/chartex" xmlns:cx4="http://schemas.microsoft.com/office/drawing/2016/5/10/chartex" xmlns:cx5="http://schemas.microsoft.com/office/drawing/2016/5/11/chartex" xmlns:cx6="http://schemas.microsoft.com/office/drawing/2016/5/12/chartex" xmlns:cx7="http://schemas.microsoft.com/office/drawing/2016/5/13/chartex" xmlns:cx8="http://schemas.microsoft.com/office/drawing/2016/5/14/chartex" xmlns:mc="http://schemas.openxmlformats.org/markup-compatibility/2006" xmlns:aink="http://schemas.microsoft.com/office/drawing/2016/ink" xmlns:am3d="http://schemas.microsoft.com/office/drawing/2017/model3d" xmlns:o="urn:schemas-microsoft-com:office:office" xmlns:oel="http://schemas.microsoft.com/office/2019/extlst" xmlns:r="http://schemas.openxmlformats.org/officeDocument/2006/relationships" xmlns:m="http://schemas.openxmlformats.org/officeDocument/2006/math" xmlns:v="urn:schemas-microsoft-com:vml" xmlns:wp14="http://schemas.microsoft.com/office/word/2010/wordprocessingDrawing" xmlns:wp="http://schemas.openxmlformats.org/drawingml/2006/wordprocessingDrawing" xmlns:w10="urn:schemas-microsoft-com:office:word" xmlns:w="http://schemas.openxmlformats.org/wordprocessingml/2006/main" xmlns:w14="http://schemas.microsoft.com/office/word/2010/wordml" xmlns:w15="http://schemas.microsoft.com/office/word/2012/wordml" xmlns:w16cex="http://schemas.microsoft.com/office/word/2018/wordml/cex" xmlns:w16cid="http://schemas.microsoft.com/office/word/2016/wordml/cid" xmlns:w16="http://schemas.microsoft.com/office/word/2018/wordml" xmlns:w16du="http://schemas.microsoft.com/office/word/2023/wordml/word16du" xmlns:w16sdtdh="http://schemas.microsoft.com/office/word/2020/wordml/sdtdatahash" xmlns:w16sdtfl="http://schemas.microsoft.com/office/word/2024/wordml/sdtformatlock" xmlns:w16se="http://schemas.microsoft.com/office/word/2015/wordml/symex" xmlns:wpg="http://schemas.microsoft.com/office/word/2010/wordprocessingGroup" xmlns:wpi="http://schemas.microsoft.com/office/word/2010/wordprocessingInk" xmlns:wne="http://schemas.microsoft.com/office/word/2006/wordml" xmlns:wps="http://schemas.microsoft.com/office/word/2010/wordprocessingShape" mc:Ignorable="w14 w15 w16se w16cid w16 w16cex w16sdtdh w16sdtfl w16du wp14">
+<w:endnotes xmlns:wpc="http://schemas.microsoft.com/office/word/2010/wordprocessingCanvas" xmlns:cx="http://schemas.microsoft.com/office/drawing/2014/chartex" xmlns:cx1="http://schemas.microsoft.com/office/drawing/2015/9/8/chartex" xmlns:cx2="http://schemas.microsoft.com/office/drawing/2015/10/21/chartex" xmlns:cx3="http://schemas.microsoft.com/office/drawing/2016/5/9/chartex" xmlns:cx4="http://schemas.microsoft.com/office/drawing/2016/5/10/chartex" xmlns:cx5="http://schemas.microsoft.com/office/drawing/2016/5/11/chartex" xmlns:cx6="http://schemas.microsoft.com/office/drawing/2016/5/12/chartex" xmlns:cx7="http://schemas.microsoft.com/office/drawing/2016/5/13/chartex" xmlns:cx8="http://schemas.microsoft.com/office/drawing/2016/5/14/chartex" xmlns:mc="http://schemas.openxmlformats.org/markup-compatibility/2006" xmlns:aink="http://schemas.microsoft.com/office/drawing/2016/ink" xmlns:am3d="http://schemas.microsoft.com/office/drawing/2017/model3d" xmlns:o="urn:schemas-microsoft-com:office:office" xmlns:oel="http://schemas.microsoft.com/office/2019/extlst" xmlns:r="http://schemas.openxmlformats.org/officeDocument/2006/relationships" xmlns:m="http://schemas.openxmlformats.org/officeDocument/2006/math" xmlns:v="urn:schemas-microsoft-com:vml" xmlns:wp14="http://schemas.microsoft.com/office/word/2010/wordprocessingDrawing" xmlns:wp="http://schemas.openxmlformats.org/drawingml/2006/wordprocessingDrawing" xmlns:w10="urn:schemas-microsoft-com:office:word" xmlns:w="http://schemas.openxmlformats.org/wordprocessingml/2006/main" xmlns:w14="http://schemas.microsoft.com/office/word/2010/wordml" xmlns:w15="http://schemas.microsoft.com/office/word/2012/wordml" xmlns:w16cex="http://schemas.microsoft.com/office/word/2018/wordml/cex" xmlns:w16cid="http://schemas.microsoft.com/office/word/2016/wordml/cid" xmlns:w16="http://schemas.microsoft.com/office/word/2018/wordml" xmlns:w16sdtdh="http://schemas.microsoft.com/office/word/2020/wordml/sdtdatahash" xmlns:w16se="http://schemas.microsoft.com/office/word/2015/wordml/symex" xmlns:wpg="http://schemas.microsoft.com/office/word/2010/wordprocessingGroup" xmlns:wpi="http://schemas.microsoft.com/office/word/2010/wordprocessingInk" xmlns:wne="http://schemas.microsoft.com/office/word/2006/wordml" xmlns:wps="http://schemas.microsoft.com/office/word/2010/wordprocessingShape" mc:Ignorable="w14 w15 w16se w16cid w16 w16cex w16sdtdh wp14">
   <w:endnote w:type="separator" w:id="-1">
     <w:p>
       <w:pPr>
@@ -1801,7 +1776,7 @@
 </file>
 
 <file path=word/footnotes.xml><?xml version="1.0" encoding="utf-8"?>
-<w:footnotes xmlns:wpc="http://schemas.microsoft.com/office/word/2010/wordprocessingCanvas" xmlns:cx="http://schemas.microsoft.com/office/drawing/2014/chartex" xmlns:cx1="http://schemas.microsoft.com/office/drawing/2015/9/8/chartex" xmlns:cx2="http://schemas.microsoft.com/office/drawing/2015/10/21/chartex" xmlns:cx3="http://schemas.microsoft.com/office/drawing/2016/5/9/chartex" xmlns:cx4="http://schemas.microsoft.com/office/drawing/2016/5/10/chartex" xmlns:cx5="http://schemas.microsoft.com/office/drawing/2016/5/11/chartex" xmlns:cx6="http://schemas.microsoft.com/office/drawing/2016/5/12/chartex" xmlns:cx7="http://schemas.microsoft.com/office/drawing/2016/5/13/chartex" xmlns:cx8="http://schemas.microsoft.com/office/drawing/2016/5/14/chartex" xmlns:mc="http://schemas.openxmlformats.org/markup-compatibility/2006" xmlns:aink="http://schemas.microsoft.com/office/drawing/2016/ink" xmlns:am3d="http://schemas.microsoft.com/office/drawing/2017/model3d" xmlns:o="urn:schemas-microsoft-com:office:office" xmlns:oel="http://schemas.microsoft.com/office/2019/extlst" xmlns:r="http://schemas.openxmlformats.org/officeDocument/2006/relationships" xmlns:m="http://schemas.openxmlformats.org/officeDocument/2006/math" xmlns:v="urn:schemas-microsoft-com:vml" xmlns:wp14="http://schemas.microsoft.com/office/word/2010/wordprocessingDrawing" xmlns:wp="http://schemas.openxmlformats.org/drawingml/2006/wordprocessingDrawing" xmlns:w10="urn:schemas-microsoft-com:office:word" xmlns:w="http://schemas.openxmlformats.org/wordprocessingml/2006/main" xmlns:w14="http://schemas.microsoft.com/office/word/2010/wordml" xmlns:w15="http://schemas.microsoft.com/office/word/2012/wordml" xmlns:w16cex="http://schemas.microsoft.com/office/word/2018/wordml/cex" xmlns:w16cid="http://schemas.microsoft.com/office/word/2016/wordml/cid" xmlns:w16="http://schemas.microsoft.com/office/word/2018/wordml" xmlns:w16du="http://schemas.microsoft.com/office/word/2023/wordml/word16du" xmlns:w16sdtdh="http://schemas.microsoft.com/office/word/2020/wordml/sdtdatahash" xmlns:w16sdtfl="http://schemas.microsoft.com/office/word/2024/wordml/sdtformatlock" xmlns:w16se="http://schemas.microsoft.com/office/word/2015/wordml/symex" xmlns:wpg="http://schemas.microsoft.com/office/word/2010/wordprocessingGroup" xmlns:wpi="http://schemas.microsoft.com/office/word/2010/wordprocessingInk" xmlns:wne="http://schemas.microsoft.com/office/word/2006/wordml" xmlns:wps="http://schemas.microsoft.com/office/word/2010/wordprocessingShape" mc:Ignorable="w14 w15 w16se w16cid w16 w16cex w16sdtdh w16sdtfl w16du wp14">
+<w:footnotes xmlns:wpc="http://schemas.microsoft.com/office/word/2010/wordprocessingCanvas" xmlns:cx="http://schemas.microsoft.com/office/drawing/2014/chartex" xmlns:cx1="http://schemas.microsoft.com/office/drawing/2015/9/8/chartex" xmlns:cx2="http://schemas.microsoft.com/office/drawing/2015/10/21/chartex" xmlns:cx3="http://schemas.microsoft.com/office/drawing/2016/5/9/chartex" xmlns:cx4="http://schemas.microsoft.com/office/drawing/2016/5/10/chartex" xmlns:cx5="http://schemas.microsoft.com/office/drawing/2016/5/11/chartex" xmlns:cx6="http://schemas.microsoft.com/office/drawing/2016/5/12/chartex" xmlns:cx7="http://schemas.microsoft.com/office/drawing/2016/5/13/chartex" xmlns:cx8="http://schemas.microsoft.com/office/drawing/2016/5/14/chartex" xmlns:mc="http://schemas.openxmlformats.org/markup-compatibility/2006" xmlns:aink="http://schemas.microsoft.com/office/drawing/2016/ink" xmlns:am3d="http://schemas.microsoft.com/office/drawing/2017/model3d" xmlns:o="urn:schemas-microsoft-com:office:office" xmlns:oel="http://schemas.microsoft.com/office/2019/extlst" xmlns:r="http://schemas.openxmlformats.org/officeDocument/2006/relationships" xmlns:m="http://schemas.openxmlformats.org/officeDocument/2006/math" xmlns:v="urn:schemas-microsoft-com:vml" xmlns:wp14="http://schemas.microsoft.com/office/word/2010/wordprocessingDrawing" xmlns:wp="http://schemas.openxmlformats.org/drawingml/2006/wordprocessingDrawing" xmlns:w10="urn:schemas-microsoft-com:office:word" xmlns:w="http://schemas.openxmlformats.org/wordprocessingml/2006/main" xmlns:w14="http://schemas.microsoft.com/office/word/2010/wordml" xmlns:w15="http://schemas.microsoft.com/office/word/2012/wordml" xmlns:w16cex="http://schemas.microsoft.com/office/word/2018/wordml/cex" xmlns:w16cid="http://schemas.microsoft.com/office/word/2016/wordml/cid" xmlns:w16="http://schemas.microsoft.com/office/word/2018/wordml" xmlns:w16sdtdh="http://schemas.microsoft.com/office/word/2020/wordml/sdtdatahash" xmlns:w16se="http://schemas.microsoft.com/office/word/2015/wordml/symex" xmlns:wpg="http://schemas.microsoft.com/office/word/2010/wordprocessingGroup" xmlns:wpi="http://schemas.microsoft.com/office/word/2010/wordprocessingInk" xmlns:wne="http://schemas.microsoft.com/office/word/2006/wordml" xmlns:wps="http://schemas.microsoft.com/office/word/2010/wordprocessingShape" mc:Ignorable="w14 w15 w16se w16cid w16 w16cex w16sdtdh wp14">
   <w:footnote w:type="separator" w:id="-1">
     <w:p>
       <w:pPr>
@@ -1826,7 +1801,7 @@
 </file>
 
 <file path=word/styles.xml><?xml version="1.0" encoding="utf-8"?>
-<w:styles xmlns:mc="http://schemas.openxmlformats.org/markup-compatibility/2006" xmlns:r="http://schemas.openxmlformats.org/officeDocument/2006/relationships" xmlns:w="http://schemas.openxmlformats.org/wordprocessingml/2006/main" xmlns:w14="http://schemas.microsoft.com/office/word/2010/wordml" xmlns:w15="http://schemas.microsoft.com/office/word/2012/wordml" xmlns:w16cex="http://schemas.microsoft.com/office/word/2018/wordml/cex" xmlns:w16cid="http://schemas.microsoft.com/office/word/2016/wordml/cid" xmlns:w16="http://schemas.microsoft.com/office/word/2018/wordml" xmlns:w16du="http://schemas.microsoft.com/office/word/2023/wordml/word16du" xmlns:w16sdtdh="http://schemas.microsoft.com/office/word/2020/wordml/sdtdatahash" xmlns:w16sdtfl="http://schemas.microsoft.com/office/word/2024/wordml/sdtformatlock" xmlns:w16se="http://schemas.microsoft.com/office/word/2015/wordml/symex" mc:Ignorable="w14 w15 w16se w16cid w16 w16cex w16sdtdh w16sdtfl w16du">
+<w:styles xmlns:mc="http://schemas.openxmlformats.org/markup-compatibility/2006" xmlns:r="http://schemas.openxmlformats.org/officeDocument/2006/relationships" xmlns:w="http://schemas.openxmlformats.org/wordprocessingml/2006/main" xmlns:w14="http://schemas.microsoft.com/office/word/2010/wordml" xmlns:w15="http://schemas.microsoft.com/office/word/2012/wordml" xmlns:w16cex="http://schemas.microsoft.com/office/word/2018/wordml/cex" xmlns:w16cid="http://schemas.microsoft.com/office/word/2016/wordml/cid" xmlns:w16="http://schemas.microsoft.com/office/word/2018/wordml" xmlns:w16sdtdh="http://schemas.microsoft.com/office/word/2020/wordml/sdtdatahash" xmlns:w16se="http://schemas.microsoft.com/office/word/2015/wordml/symex" mc:Ignorable="w14 w15 w16se w16cid w16 w16cex w16sdtdh">
   <w:docDefaults>
     <w:rPrDefault>
       <w:rPr>

</xml_diff>